<commit_message>
docs(report): trim advisor-decision section, drop VLUTE affiliation
Per request: keep only the main progress content (remove the G1-G3 decision
gates and pending-approval framing) and list the candidate as Đỗ Thùy Hương
without the VLUTE affiliation. Rebuilt docx + pdf.

Co-Authored-By: Claude Opus 4.8 (1M context) <noreply@anthropic.com>
Claude-Session: https://claude.ai/code/session_01Xumaoraa2DLWLXsgJJ62oq
</commit_message>
<xml_diff>
--- a/docs/BAO_CAO_TIEN_DO_GVHD_2026-06.docx
+++ b/docs/BAO_CAO_TIEN_DO_GVHD_2026-06.docx
@@ -44,7 +44,7 @@
         <w:t xml:space="preserve"> </w:t>
       </w:r>
       <w:r>
-        <w:t xml:space="preserve">Đỗ Thùy Hương — Trường Đại học Kỹ thuật Công nghệ Vĩnh Long (VLUTE)</w:t>
+        <w:t xml:space="preserve">Đỗ Thùy Hương</w:t>
       </w:r>
     </w:p>
     <w:p>
@@ -1281,7 +1281,7 @@
       </w:r>
     </w:p>
     <w:bookmarkEnd w:id="27"/>
-    <w:bookmarkStart w:id="29" w:name="b.-cập-nhật-quan-trọng-16-1962026"/>
+    <w:bookmarkStart w:id="28" w:name="b.-cập-nhật-quan-trọng-16-1962026"/>
     <w:p>
       <w:pPr>
         <w:pStyle w:val="Heading2"/>
@@ -1661,222 +1661,14 @@
         <w:t xml:space="preserve">các nhóm không-SIDS của Bảng 4.2; dòng Nhóm VI đã được cập nhật về giá trị 7 nền Pacific (đổi mới sản phẩm 39,6%, website 47,1%…). Mọi số mô tả nay tái lập được từ mã + dữ liệu đã commit.</w:t>
       </w:r>
     </w:p>
-    <w:bookmarkStart w:id="28" w:name="các-điểm-xin-thầy-quyết-định"/>
-    <w:p>
-      <w:pPr>
-        <w:pStyle w:val="Heading3"/>
-      </w:pPr>
-      <w:r>
-        <w:t xml:space="preserve">Các điểm xin Thầy quyết định</w:t>
-      </w:r>
-    </w:p>
-    <w:tbl>
-      <w:tblPr>
-        <w:tblStyle w:val="Table"/>
-        <w:tblW w:type="pct" w:w="5000"/>
-        <w:tblLook w:firstRow="1" w:lastRow="0" w:firstColumn="0" w:lastColumn="0" w:noHBand="0" w:noVBand="0" w:val="0020"/>
-        <w:jc w:val="start"/>
-      </w:tblPr>
-      <w:tblGrid>
-        <w:gridCol w:w="2640"/>
-        <w:gridCol w:w="2640"/>
-        <w:gridCol w:w="2640"/>
-      </w:tblGrid>
-      <w:tr>
-        <w:trPr>
-          <w:tblHeader w:val="true"/>
-        </w:trPr>
-        <w:tc>
-          <w:tcPr/>
-          <w:p>
-            <w:pPr>
-              <w:pStyle w:val="Compact"/>
-              <w:jc w:val="left"/>
-            </w:pPr>
-            <w:r>
-              <w:t xml:space="preserve">#</w:t>
-            </w:r>
-          </w:p>
-        </w:tc>
-        <w:tc>
-          <w:tcPr/>
-          <w:p>
-            <w:pPr>
-              <w:pStyle w:val="Compact"/>
-              <w:jc w:val="left"/>
-            </w:pPr>
-            <w:r>
-              <w:t xml:space="preserve">Nội dung</w:t>
-            </w:r>
-          </w:p>
-        </w:tc>
-        <w:tc>
-          <w:tcPr/>
-          <w:p>
-            <w:pPr>
-              <w:pStyle w:val="Compact"/>
-              <w:jc w:val="left"/>
-            </w:pPr>
-            <w:r>
-              <w:t xml:space="preserve">Vì sao cần</w:t>
-            </w:r>
-          </w:p>
-        </w:tc>
-      </w:tr>
-      <w:tr>
-        <w:tc>
-          <w:tcPr/>
-          <w:p>
-            <w:pPr>
-              <w:pStyle w:val="Compact"/>
-              <w:jc w:val="left"/>
-            </w:pPr>
-            <w:r>
-              <w:rPr>
-                <w:bCs/>
-                <w:b/>
-              </w:rPr>
-              <w:t xml:space="preserve">G1</w:t>
-            </w:r>
-          </w:p>
-        </w:tc>
-        <w:tc>
-          <w:tcPr/>
-          <w:p>
-            <w:pPr>
-              <w:pStyle w:val="Compact"/>
-              <w:jc w:val="left"/>
-            </w:pPr>
-            <w:r>
-              <w:t xml:space="preserve">Chấp thuận pipeline mô tả canonical làm chuẩn; chấp nhận một vài số mô tả thay đổi nhẹ so với bản in cũ (vì chuyển sang tái lập được)</w:t>
-            </w:r>
-          </w:p>
-        </w:tc>
-        <w:tc>
-          <w:tcPr/>
-          <w:p>
-            <w:pPr>
-              <w:pStyle w:val="Compact"/>
-              <w:jc w:val="left"/>
-            </w:pPr>
-            <w:r>
-              <w:t xml:space="preserve">Để hoàn tất re-lock các bảng mô tả còn lại (cột n Bảng 4.1 các nhóm khác)</w:t>
-            </w:r>
-          </w:p>
-        </w:tc>
-      </w:tr>
-      <w:tr>
-        <w:tc>
-          <w:tcPr/>
-          <w:p>
-            <w:pPr>
-              <w:pStyle w:val="Compact"/>
-              <w:jc w:val="left"/>
-            </w:pPr>
-            <w:r>
-              <w:rPr>
-                <w:bCs/>
-                <w:b/>
-              </w:rPr>
-              <w:t xml:space="preserve">G2</w:t>
-            </w:r>
-          </w:p>
-        </w:tc>
-        <w:tc>
-          <w:tcPr/>
-          <w:p>
-            <w:pPr>
-              <w:pStyle w:val="Compact"/>
-              <w:jc w:val="left"/>
-            </w:pPr>
-            <w:r>
-              <w:t xml:space="preserve">Dùng khung tái lập 49 nền / 87.987 thay tổng locked 96.415/88.869</w:t>
-            </w:r>
-          </w:p>
-        </w:tc>
-        <w:tc>
-          <w:tcPr/>
-          <w:p>
-            <w:pPr>
-              <w:pStyle w:val="Compact"/>
-              <w:jc w:val="left"/>
-            </w:pPr>
-            <w:r>
-              <w:t xml:space="preserve">Thống nhất</w:t>
-            </w:r>
-            <w:r>
-              <w:t xml:space="preserve"> </w:t>
-            </w:r>
-            <w:r>
-              <w:t xml:space="preserve">“</w:t>
-            </w:r>
-            <w:r>
-              <w:t xml:space="preserve">một nguồn chân lý</w:t>
-            </w:r>
-            <w:r>
-              <w:t xml:space="preserve">”</w:t>
-            </w:r>
-            <w:r>
-              <w:t xml:space="preserve"> </w:t>
-            </w:r>
-            <w:r>
-              <w:t xml:space="preserve">cho toàn luận án</w:t>
-            </w:r>
-          </w:p>
-        </w:tc>
-      </w:tr>
-      <w:tr>
-        <w:tc>
-          <w:tcPr/>
-          <w:p>
-            <w:pPr>
-              <w:pStyle w:val="Compact"/>
-              <w:jc w:val="left"/>
-            </w:pPr>
-            <w:r>
-              <w:rPr>
-                <w:bCs/>
-                <w:b/>
-              </w:rPr>
-              <w:t xml:space="preserve">G3</w:t>
-            </w:r>
-          </w:p>
-        </w:tc>
-        <w:tc>
-          <w:tcPr/>
-          <w:p>
-            <w:pPr>
-              <w:pStyle w:val="Compact"/>
-              <w:jc w:val="left"/>
-            </w:pPr>
-            <w:r>
-              <w:t xml:space="preserve">Duyệt định vị mới của P8 (dissolution) + xác nhận khối tác giả/đơn vị và tạp chí nộp (World Development)</w:t>
-            </w:r>
-          </w:p>
-        </w:tc>
-        <w:tc>
-          <w:tcPr/>
-          <w:p>
-            <w:pPr>
-              <w:pStyle w:val="Compact"/>
-              <w:jc w:val="left"/>
-            </w:pPr>
-            <w:r>
-              <w:t xml:space="preserve">Mở khóa nộp P8</w:t>
-            </w:r>
-          </w:p>
-        </w:tc>
-      </w:tr>
-    </w:tbl>
     <w:bookmarkEnd w:id="28"/>
-    <w:bookmarkEnd w:id="29"/>
-    <w:bookmarkStart w:id="30" w:name="công-việc-tiếp-theo-xin-ý-kiến-thầy"/>
+    <w:bookmarkStart w:id="29" w:name="công-việc-tiếp-theo"/>
     <w:p>
       <w:pPr>
         <w:pStyle w:val="Heading2"/>
       </w:pPr>
       <w:r>
-        <w:t xml:space="preserve">5. Công việc tiếp theo (xin ý kiến Thầy)</w:t>
+        <w:t xml:space="preserve">5. Công việc tiếp theo</w:t>
       </w:r>
     </w:p>
     <w:p>
@@ -1888,17 +1680,7 @@
         <w:pStyle w:val="Compact"/>
       </w:pPr>
       <w:r>
-        <w:rPr>
-          <w:bCs/>
-          <w:b/>
-        </w:rPr>
-        <w:t xml:space="preserve">Xác thực hệ số bằng Stata</w:t>
-      </w:r>
-      <w:r>
-        <w:t xml:space="preserve"> </w:t>
-      </w:r>
-      <w:r>
-        <w:t xml:space="preserve">trên máy có bản quyền (checklist 7 bước đã chuẩn bị) trước khi nộp P7/P8/P9.</w:t>
+        <w:t xml:space="preserve">Xác thực hệ số bằng Stata trên máy có bản quyền (checklist 7 bước đã chuẩn bị) trước khi nộp P7/P8/P9.</w:t>
       </w:r>
     </w:p>
     <w:p>
@@ -1910,17 +1692,7 @@
         <w:pStyle w:val="Compact"/>
       </w:pPr>
       <w:r>
-        <w:rPr>
-          <w:bCs/>
-          <w:b/>
-        </w:rPr>
-        <w:t xml:space="preserve">Lựa chọn tạp chí nộp đầu tiên</w:t>
-      </w:r>
-      <w:r>
-        <w:t xml:space="preserve"> </w:t>
-      </w:r>
-      <w:r>
-        <w:t xml:space="preserve">cho từng bản thảo trong danh sách mục tiêu (xin định hướng của Thầy).</w:t>
+        <w:t xml:space="preserve">Hoàn thiện gói nộp tạp chí cho từng bản thảo trong danh sách mục tiêu.</w:t>
       </w:r>
     </w:p>
     <w:p>
@@ -1932,7 +1704,7 @@
         <w:pStyle w:val="Compact"/>
       </w:pPr>
       <w:r>
-        <w:t xml:space="preserve">Biên dịch PDF slide bảo vệ và hoàn thiện thông tin GVHD trên trang bìa.</w:t>
+        <w:t xml:space="preserve">Biên dịch PDF slide bảo vệ và hoàn thiện thông tin trang bìa.</w:t>
       </w:r>
     </w:p>
     <w:p>
@@ -1944,23 +1716,7 @@
         <w:pStyle w:val="Compact"/>
       </w:pPr>
       <w:r>
-        <w:t xml:space="preserve">Hoàn tất</w:t>
-      </w:r>
-      <w:r>
-        <w:t xml:space="preserve"> </w:t>
-      </w:r>
-      <w:r>
-        <w:rPr>
-          <w:bCs/>
-          <w:b/>
-        </w:rPr>
-        <w:t xml:space="preserve">re-lock mô tả toàn diện</w:t>
-      </w:r>
-      <w:r>
-        <w:t xml:space="preserve"> </w:t>
-      </w:r>
-      <w:r>
-        <w:t xml:space="preserve">(cột n Bảng 4.1 mọi nhóm sang khung tái lập) sau khi Thầy duyệt G1–G2.</w:t>
+        <w:t xml:space="preserve">Hoàn tất re-lock mô tả toàn diện (đồng bộ cột n các bảng mô tả sang khung tái lập 49 nền).</w:t>
       </w:r>
     </w:p>
     <w:p>
@@ -1972,11 +1728,11 @@
         <w:pStyle w:val="Compact"/>
       </w:pPr>
       <w:r>
-        <w:t xml:space="preserve">Kế hoạch mở rộng sau bảo vệ: bổ sung các nền/đợt khảo sát mới (gồm cân nhắc lại Timor-Leste như một nền Đông Nam Á riêng, không thuộc SIDS).</w:t>
-      </w:r>
-    </w:p>
-    <w:bookmarkEnd w:id="30"/>
-    <w:bookmarkStart w:id="31" w:name="X3bba61bd4712943d0c5691e4083e39f59b5964b"/>
+        <w:t xml:space="preserve">Kế hoạch mở rộng sau bảo vệ: bổ sung các nền và đợt khảo sát mới.</w:t>
+      </w:r>
+    </w:p>
+    <w:bookmarkEnd w:id="29"/>
+    <w:bookmarkStart w:id="30" w:name="X3bba61bd4712943d0c5691e4083e39f59b5964b"/>
     <w:p>
       <w:pPr>
         <w:pStyle w:val="Heading2"/>
@@ -2465,7 +2221,7 @@
         <w:t xml:space="preserve">Kính trình Thầy xem xét và cho ý kiến định hướng.</w:t>
       </w:r>
     </w:p>
-    <w:bookmarkEnd w:id="31"/>
+    <w:bookmarkEnd w:id="30"/>
     <w:sectPr>
       <w:pgSz w:h="16838" w:w="11906"/>
       <w:pgMar w:bottom="1417" w:left="1417" w:right="1417" w:top="1417"/>

</xml_diff>